<commit_message>
feat: implement user authentication system and document inspection agent architecture documentation
</commit_message>
<xml_diff>
--- a/backend/generated/Approval_Note_127a43a0-a49f-434e-8deb-2fb106d1f599.docx
+++ b/backend/generated/Approval_Note_127a43a0-a49f-434e-8deb-2fb106d1f599.docx
@@ -83,7 +83,7 @@
           <w:rFonts w:ascii="Arial" w:hAnsi="Arial"/>
           <w:sz w:val="20"/>
         </w:rPr>
-        <w:t>An industrial inspection identified 5 finding(s) on P-101. Operational parameters were recorded during standard inspection routines and evaluated against documented standard operating procedures (SOPs) to produce this assessment.</w:t>
+        <w:t>An industrial inspection identified 4 finding(s) on P-101. Operational parameters were recorded during standard inspection routines and evaluated against documented standard operating procedures (SOPs) to produce this assessment.</w:t>
       </w:r>
     </w:p>
     <w:p>
@@ -174,7 +174,7 @@
                 <w:rFonts w:ascii="Arial" w:hAnsi="Arial"/>
                 <w:sz w:val="19"/>
               </w:rPr>
-              <w:t>92 °C exceeds normal limit of 80 °C</w:t>
+              <w:t>Abnormal bearing temperature</w:t>
             </w:r>
           </w:p>
         </w:tc>
@@ -330,7 +330,7 @@
                 <w:rFonts w:ascii="Arial" w:hAnsi="Arial"/>
                 <w:sz w:val="19"/>
               </w:rPr>
-              <w:t>up to 80 °C</w:t>
+              <w:t>Up to 80 °C</w:t>
             </w:r>
           </w:p>
         </w:tc>
@@ -382,7 +382,7 @@
                 <w:rFonts w:ascii="Arial" w:hAnsi="Arial"/>
                 <w:sz w:val="19"/>
               </w:rPr>
-              <w:t>abnormal</w:t>
+              <w:t>ABNORMAL</w:t>
             </w:r>
           </w:p>
         </w:tc>
@@ -434,7 +434,7 @@
                 <w:rFonts w:ascii="Arial" w:hAnsi="Arial"/>
                 <w:sz w:val="19"/>
               </w:rPr>
-              <w:t>The report does not contain the SOP itself; the agent is expected to retrieve the separate knowledge-base document.  Knowledge-base topic  Expected relationship  Bearing Temperature Monitoring   Observed 92 °C exceeds normal limit of 80 °C.</w:t>
+              <w:t>The observed temperature and vibration values were recorded against equipment P-101. The bearing temperature was recorded above the normal operating limit.</w:t>
             </w:r>
           </w:p>
         </w:tc>
@@ -518,7 +518,7 @@
                 <w:rFonts w:ascii="Arial" w:hAnsi="Arial"/>
                 <w:sz w:val="19"/>
               </w:rPr>
-              <w:t>6.8 mm/s RMS requires recording and rotating-assembly/bearing checks</w:t>
+              <w:t>Abnormal vibration</w:t>
             </w:r>
           </w:p>
         </w:tc>
@@ -674,7 +674,7 @@
                 <w:rFonts w:ascii="Arial" w:hAnsi="Arial"/>
                 <w:sz w:val="19"/>
               </w:rPr>
-              <w:t>up to 4.5 mm/s RMS</w:t>
+              <w:t>Up to 4.5 mm/s RMS</w:t>
             </w:r>
           </w:p>
         </w:tc>
@@ -726,7 +726,7 @@
                 <w:rFonts w:ascii="Arial" w:hAnsi="Arial"/>
                 <w:sz w:val="19"/>
               </w:rPr>
-              <w:t>abnormal</w:t>
+              <w:t>ABNORMAL</w:t>
             </w:r>
           </w:p>
         </w:tc>
@@ -778,7 +778,7 @@
                 <w:rFonts w:ascii="Arial" w:hAnsi="Arial"/>
                 <w:sz w:val="19"/>
               </w:rPr>
-              <w:t>The inspection included review of equipment condition, bearing temperature measurement, vibration measurement, lubrication-condition observation, and visual inspection for leakage and other operational anomalies.</w:t>
+              <w:t>Vibration at the pump bearing housing was measured at 6.8 mm/s RMS, compared with the synthetic inspection criterion of 4.5 mm/s RMS.</w:t>
             </w:r>
           </w:p>
         </w:tc>
@@ -862,7 +862,7 @@
                 <w:rFonts w:ascii="Arial" w:hAnsi="Arial"/>
                 <w:sz w:val="19"/>
               </w:rPr>
-              <w:t>Low / insufficient grease observed</w:t>
+              <w:t>Inadequate lubrication condition</w:t>
             </w:r>
           </w:p>
         </w:tc>
@@ -1070,7 +1070,7 @@
                 <w:rFonts w:ascii="Arial" w:hAnsi="Arial"/>
                 <w:sz w:val="19"/>
               </w:rPr>
-              <w:t>abnormal</w:t>
+              <w:t>ABNORMAL</w:t>
             </w:r>
           </w:p>
         </w:tc>
@@ -1122,7 +1122,7 @@
                 <w:rFonts w:ascii="Arial" w:hAnsi="Arial"/>
                 <w:sz w:val="19"/>
               </w:rPr>
-              <w:t>2. Inspection Observations  Parameter   Observed   Applicable Normal Limit   Status  Bearing temperature   92 °C   Up to 80 °C   ABNORMAL Vibration   6.8 mm/s RMS   Up to 4.5 mm/s RMS   ABNORMAL Lubrication condition   Low / insufficient grease observed Adequate lubrication required</w:t>
+              <w:t>The bearing area showed signs of inadequate lubrication.</w:t>
             </w:r>
           </w:p>
         </w:tc>
@@ -1206,351 +1206,7 @@
                 <w:rFonts w:ascii="Arial" w:hAnsi="Arial"/>
                 <w:sz w:val="19"/>
               </w:rPr>
-              <w:t>Abnormal vibration was recorded</w:t>
-            </w:r>
-          </w:p>
-        </w:tc>
-      </w:tr>
-      <w:tr>
-        <w:tc>
-          <w:tcPr>
-            <w:tcW w:type="dxa" w:w="2592"/>
-            <w:shd w:fill="EDF2F7"/>
-            <w:tcMar>
-              <w:top w:w="70" w:type="dxa"/>
-              <w:bottom w:w="70" w:type="dxa"/>
-              <w:left w:w="100" w:type="dxa"/>
-              <w:right w:w="100" w:type="dxa"/>
-            </w:tcMar>
-          </w:tcPr>
-          <w:p>
-            <w:pPr>
-              <w:spacing w:before="40" w:after="40"/>
-            </w:pPr>
-            <w:r>
-              <w:rPr>
-                <w:rFonts w:ascii="Arial" w:hAnsi="Arial"/>
-                <w:b/>
-                <w:color w:val="2D3748"/>
-                <w:sz w:val="19"/>
-              </w:rPr>
-              <w:t>Equipment</w:t>
-            </w:r>
-          </w:p>
-        </w:tc>
-        <w:tc>
-          <w:tcPr>
-            <w:tcW w:type="dxa" w:w="6768"/>
-            <w:shd w:fill="FFFFFF"/>
-            <w:tcMar>
-              <w:top w:w="70" w:type="dxa"/>
-              <w:bottom w:w="70" w:type="dxa"/>
-              <w:left w:w="100" w:type="dxa"/>
-              <w:right w:w="100" w:type="dxa"/>
-            </w:tcMar>
-          </w:tcPr>
-          <w:p>
-            <w:pPr>
-              <w:spacing w:before="40" w:after="40"/>
-            </w:pPr>
-            <w:r>
-              <w:rPr>
-                <w:rFonts w:ascii="Arial" w:hAnsi="Arial"/>
-                <w:sz w:val="19"/>
-              </w:rPr>
-              <w:t>P-101</w:t>
-            </w:r>
-          </w:p>
-        </w:tc>
-      </w:tr>
-      <w:tr>
-        <w:tc>
-          <w:tcPr>
-            <w:tcW w:type="dxa" w:w="2592"/>
-            <w:shd w:fill="EDF2F7"/>
-            <w:tcMar>
-              <w:top w:w="70" w:type="dxa"/>
-              <w:bottom w:w="70" w:type="dxa"/>
-              <w:left w:w="100" w:type="dxa"/>
-              <w:right w:w="100" w:type="dxa"/>
-            </w:tcMar>
-          </w:tcPr>
-          <w:p>
-            <w:pPr>
-              <w:spacing w:before="40" w:after="40"/>
-            </w:pPr>
-            <w:r>
-              <w:rPr>
-                <w:rFonts w:ascii="Arial" w:hAnsi="Arial"/>
-                <w:b/>
-                <w:color w:val="2D3748"/>
-                <w:sz w:val="19"/>
-              </w:rPr>
-              <w:t>Observed Value</w:t>
-            </w:r>
-          </w:p>
-        </w:tc>
-        <w:tc>
-          <w:tcPr>
-            <w:tcW w:type="dxa" w:w="6768"/>
-            <w:shd w:fill="FFFFFF"/>
-            <w:tcMar>
-              <w:top w:w="70" w:type="dxa"/>
-              <w:bottom w:w="70" w:type="dxa"/>
-              <w:left w:w="100" w:type="dxa"/>
-              <w:right w:w="100" w:type="dxa"/>
-            </w:tcMar>
-          </w:tcPr>
-          <w:p>
-            <w:pPr>
-              <w:spacing w:before="40" w:after="40"/>
-            </w:pPr>
-            <w:r>
-              <w:rPr>
-                <w:rFonts w:ascii="Arial" w:hAnsi="Arial"/>
-                <w:sz w:val="19"/>
-              </w:rPr>
-              <w:t>6.8 mm/s RMS</w:t>
-            </w:r>
-          </w:p>
-        </w:tc>
-      </w:tr>
-      <w:tr>
-        <w:tc>
-          <w:tcPr>
-            <w:tcW w:type="dxa" w:w="2592"/>
-            <w:shd w:fill="EDF2F7"/>
-            <w:tcMar>
-              <w:top w:w="70" w:type="dxa"/>
-              <w:bottom w:w="70" w:type="dxa"/>
-              <w:left w:w="100" w:type="dxa"/>
-              <w:right w:w="100" w:type="dxa"/>
-            </w:tcMar>
-          </w:tcPr>
-          <w:p>
-            <w:pPr>
-              <w:spacing w:before="40" w:after="40"/>
-            </w:pPr>
-            <w:r>
-              <w:rPr>
-                <w:rFonts w:ascii="Arial" w:hAnsi="Arial"/>
-                <w:b/>
-                <w:color w:val="2D3748"/>
-                <w:sz w:val="19"/>
-              </w:rPr>
-              <w:t>Limit</w:t>
-            </w:r>
-          </w:p>
-        </w:tc>
-        <w:tc>
-          <w:tcPr>
-            <w:tcW w:type="dxa" w:w="6768"/>
-            <w:shd w:fill="FFFFFF"/>
-            <w:tcMar>
-              <w:top w:w="70" w:type="dxa"/>
-              <w:bottom w:w="70" w:type="dxa"/>
-              <w:left w:w="100" w:type="dxa"/>
-              <w:right w:w="100" w:type="dxa"/>
-            </w:tcMar>
-          </w:tcPr>
-          <w:p>
-            <w:pPr>
-              <w:spacing w:before="40" w:after="40"/>
-            </w:pPr>
-            <w:r>
-              <w:rPr>
-                <w:rFonts w:ascii="Arial" w:hAnsi="Arial"/>
-                <w:sz w:val="19"/>
-              </w:rPr>
-              <w:t>up to 4.5 mm/s RMS</w:t>
-            </w:r>
-          </w:p>
-        </w:tc>
-      </w:tr>
-      <w:tr>
-        <w:tc>
-          <w:tcPr>
-            <w:tcW w:type="dxa" w:w="2592"/>
-            <w:shd w:fill="EDF2F7"/>
-            <w:tcMar>
-              <w:top w:w="70" w:type="dxa"/>
-              <w:bottom w:w="70" w:type="dxa"/>
-              <w:left w:w="100" w:type="dxa"/>
-              <w:right w:w="100" w:type="dxa"/>
-            </w:tcMar>
-          </w:tcPr>
-          <w:p>
-            <w:pPr>
-              <w:spacing w:before="40" w:after="40"/>
-            </w:pPr>
-            <w:r>
-              <w:rPr>
-                <w:rFonts w:ascii="Arial" w:hAnsi="Arial"/>
-                <w:b/>
-                <w:color w:val="2D3748"/>
-                <w:sz w:val="19"/>
-              </w:rPr>
-              <w:t>Severity</w:t>
-            </w:r>
-          </w:p>
-        </w:tc>
-        <w:tc>
-          <w:tcPr>
-            <w:tcW w:type="dxa" w:w="6768"/>
-            <w:shd w:fill="FFFFFF"/>
-            <w:tcMar>
-              <w:top w:w="70" w:type="dxa"/>
-              <w:bottom w:w="70" w:type="dxa"/>
-              <w:left w:w="100" w:type="dxa"/>
-              <w:right w:w="100" w:type="dxa"/>
-            </w:tcMar>
-          </w:tcPr>
-          <w:p>
-            <w:pPr>
-              <w:spacing w:before="40" w:after="40"/>
-            </w:pPr>
-            <w:r>
-              <w:rPr>
-                <w:rFonts w:ascii="Arial" w:hAnsi="Arial"/>
-                <w:sz w:val="19"/>
-              </w:rPr>
-              <w:t>abnormal</w:t>
-            </w:r>
-          </w:p>
-        </w:tc>
-      </w:tr>
-      <w:tr>
-        <w:tc>
-          <w:tcPr>
-            <w:tcW w:type="dxa" w:w="2592"/>
-            <w:shd w:fill="EDF2F7"/>
-            <w:tcMar>
-              <w:top w:w="70" w:type="dxa"/>
-              <w:bottom w:w="70" w:type="dxa"/>
-              <w:left w:w="100" w:type="dxa"/>
-              <w:right w:w="100" w:type="dxa"/>
-            </w:tcMar>
-          </w:tcPr>
-          <w:p>
-            <w:pPr>
-              <w:spacing w:before="40" w:after="40"/>
-            </w:pPr>
-            <w:r>
-              <w:rPr>
-                <w:rFonts w:ascii="Arial" w:hAnsi="Arial"/>
-                <w:b/>
-                <w:color w:val="2D3748"/>
-                <w:sz w:val="19"/>
-              </w:rPr>
-              <w:t>Evidence</w:t>
-            </w:r>
-          </w:p>
-        </w:tc>
-        <w:tc>
-          <w:tcPr>
-            <w:tcW w:type="dxa" w:w="6768"/>
-            <w:shd w:fill="FFFFFF"/>
-            <w:tcMar>
-              <w:top w:w="70" w:type="dxa"/>
-              <w:bottom w:w="70" w:type="dxa"/>
-              <w:left w:w="100" w:type="dxa"/>
-              <w:right w:w="100" w:type="dxa"/>
-            </w:tcMar>
-          </w:tcPr>
-          <w:p>
-            <w:pPr>
-              <w:spacing w:before="40" w:after="40"/>
-            </w:pPr>
-            <w:r>
-              <w:rPr>
-                <w:rFonts w:ascii="Arial" w:hAnsi="Arial"/>
-                <w:sz w:val="19"/>
-              </w:rPr>
-              <w:t>Finding F-002 — Abnormal vibration was recorded.  Vibration at the pump bearing housing was measured at 6.8 mm/s RMS, compared with the synthetic inspection criterion of 4.5 mm/s RMS.</w:t>
-            </w:r>
-          </w:p>
-        </w:tc>
-      </w:tr>
-    </w:tbl>
-    <w:p>
-      <w:pPr>
-        <w:spacing w:before="0" w:after="120"/>
-      </w:pPr>
-    </w:p>
-    <w:p>
-      <w:pPr>
-        <w:keepNext/>
-        <w:spacing w:before="120" w:after="80"/>
-      </w:pPr>
-      <w:r>
-        <w:rPr>
-          <w:rFonts w:ascii="Arial" w:hAnsi="Arial"/>
-          <w:b/>
-          <w:color w:val="2D3748"/>
-          <w:sz w:val="22"/>
-        </w:rPr>
-        <w:t>Finding 5</w:t>
-      </w:r>
-    </w:p>
-    <w:tbl>
-      <w:tblPr>
-        <w:tblW w:type="auto" w:w="0"/>
-        <w:jc w:val="center"/>
-        <w:tblLayout w:type="fixed"/>
-        <w:tblLook w:firstColumn="1" w:firstRow="1" w:lastColumn="0" w:lastRow="0" w:noHBand="0" w:noVBand="1" w:val="04A0"/>
-      </w:tblPr>
-      <w:tblGrid>
-        <w:gridCol w:w="4680"/>
-        <w:gridCol w:w="4680"/>
-      </w:tblGrid>
-      <w:tr>
-        <w:tc>
-          <w:tcPr>
-            <w:tcW w:type="dxa" w:w="2592"/>
-            <w:shd w:fill="EDF2F7"/>
-            <w:tcMar>
-              <w:top w:w="70" w:type="dxa"/>
-              <w:bottom w:w="70" w:type="dxa"/>
-              <w:left w:w="100" w:type="dxa"/>
-              <w:right w:w="100" w:type="dxa"/>
-            </w:tcMar>
-          </w:tcPr>
-          <w:p>
-            <w:pPr>
-              <w:spacing w:before="40" w:after="40"/>
-            </w:pPr>
-            <w:r>
-              <w:rPr>
-                <w:rFonts w:ascii="Arial" w:hAnsi="Arial"/>
-                <w:b/>
-                <w:color w:val="2D3748"/>
-                <w:sz w:val="19"/>
-              </w:rPr>
-              <w:t>Finding</w:t>
-            </w:r>
-          </w:p>
-        </w:tc>
-        <w:tc>
-          <w:tcPr>
-            <w:tcW w:type="dxa" w:w="6768"/>
-            <w:shd w:fill="FFFFFF"/>
-            <w:tcMar>
-              <w:top w:w="70" w:type="dxa"/>
-              <w:bottom w:w="70" w:type="dxa"/>
-              <w:left w:w="100" w:type="dxa"/>
-              <w:right w:w="100" w:type="dxa"/>
-            </w:tcMar>
-          </w:tcPr>
-          <w:p>
-            <w:pPr>
-              <w:spacing w:before="40" w:after="40"/>
-            </w:pPr>
-            <w:r>
-              <w:rPr>
-                <w:rFonts w:ascii="Arial" w:hAnsi="Arial"/>
-                <w:sz w:val="19"/>
-              </w:rPr>
-              <w:t>The equipment should remain under controlled maintenance review until the bearing condition has been inspected and corrective actions have been completed in accordance with the applicable company procedures</w:t>
+              <w:t>Equipment kept out of normal service</w:t>
             </w:r>
           </w:p>
         </w:tc>
@@ -1810,7 +1466,7 @@
                 <w:rFonts w:ascii="Arial" w:hAnsi="Arial"/>
                 <w:sz w:val="19"/>
               </w:rPr>
-              <w:t>The inspection identified abnormal bearing temperature, elevated vibration, and inadequate lubrication on P-101. The equipment should remain under controlled maintenance review until the bearing condition has been inspected and corrective actions have been completed in accordance with the applicable company procedures.</w:t>
+              <w:t>The equipment was kept out of normal service pending inspection and corrective action.</w:t>
             </w:r>
           </w:p>
         </w:tc>
@@ -1845,7 +1501,7 @@
           <w:rFonts w:ascii="Arial" w:hAnsi="Arial"/>
           <w:sz w:val="20"/>
         </w:rPr>
-        <w:t>Evaluation was performed by correlating observed parameters against standard operating procedures (Demo_Maintenance_SOP.pdf, Demo_Inspection_Guidelines.pdf). Assessment analysis indicates: The observed temperature of 92 °C exceeds the normal limit of 80 °C, and the agent has retrieved the knowledge-base document confirming the expected relationship between bearing temperature monitoring and the observed temperature.</w:t>
+        <w:t>Evaluation was performed by correlating observed parameters against standard operating procedures (Demo_Safety_SOP.pdf, Demo_Maintenance_SOP.pdf). Assessment analysis indicates: The observed bearing temperature (92 °C) is above the normal operating limit (80 °C), but the SOP EVIDENCE does not explicitly state consequences for temperatures within the 80-90 °C range, and no indication of imminent danger is provided.</w:t>
       </w:r>
     </w:p>
     <w:p>
@@ -1900,7 +1556,7 @@
         <w:tc>
           <w:tcPr>
             <w:tcW w:type="dxa" w:w="6768"/>
-            <w:shd w:fill="FEEBC8"/>
+            <w:shd w:fill="C6F6D5"/>
             <w:tcMar>
               <w:top w:w="80" w:type="dxa"/>
               <w:bottom w:w="80" w:type="dxa"/>
@@ -1913,10 +1569,10 @@
               <w:rPr>
                 <w:rFonts w:ascii="Arial" w:hAnsi="Arial"/>
                 <w:b/>
-                <w:color w:val="B7791F"/>
+                <w:color w:val="287465"/>
                 <w:sz w:val="22"/>
               </w:rPr>
-              <w:t>MEDIUM</w:t>
+              <w:t>LOW</w:t>
             </w:r>
           </w:p>
         </w:tc>
@@ -1961,7 +1617,7 @@
                 <w:rFonts w:ascii="Arial" w:hAnsi="Arial"/>
                 <w:sz w:val="19"/>
               </w:rPr>
-              <w:t>The observed temperature of 92 °C exceeds the normal limit of 80 °C, and the agent has retrieved the knowledge-base document confirming the expected relationship between bearing temperature monitoring and the observed temperature.</w:t>
+              <w:t>The observed bearing temperature (92 °C) is above the normal operating limit (80 °C), but the SOP EVIDENCE does not explicitly state consequences for temperatures within the 80-90 °C range, and no indication of imminent danger is provided.</w:t>
             </w:r>
           </w:p>
         </w:tc>
@@ -2019,7 +1675,7 @@
                 <w:color w:val="2B6CB0"/>
                 <w:sz w:val="20"/>
               </w:rPr>
-              <w:t>Schedule an inspection to verify the bearing assembly and check the lubrication condition, and do not return the equipment to service until the inspection is complete. Record the observed vibration reading and perform a bearing/rotating assembly check on the P-101 equipment. Schedule a comprehensive inspection and check lubrication condition to ensure adequate lubrication is applied. Conduct a comprehensive inspection of the bearing assembly, check lubrication condition, and check for abnormal vibration. Record the observed temperature and take corrective actions as necessary. Perform a comprehensive inspection of P-101 as per SOP-INSP-001, and initiate corrective actions to address the bearing condition, including recording the observed temperature, inspecting the bearing assembly, checking lubrication condition, and checking for abnormal vibration.</w:t>
+              <w:t>Record the observed temperature and inspect the bearing assembly, check lubrication condition, and check for abnormal vibration. Perform lockout/tagout procedure and inspect the bearing assembly, check lubrication condition, and check for abnormal vibration to determine the cause of the abnormal vibration and take corrective action to prevent future occurrences. Improve lubrication condition by applying adequate grease to the bearing area, and schedule regular maintenance to ensure the lubrication system is functioning correctly. Immediate inspection and corrective action should be performed on the P-101 equipment to ensure it is operating within normal limits and safely. This may include lubrication checks, bearing assembly inspection, and vibration analysis. The lockout/tagout procedure should also be reviewed and updated to ensure it aligns with the latest safety standards and regulations.</w:t>
             </w:r>
           </w:p>
         </w:tc>
@@ -2084,7 +1740,28 @@
           <w:rFonts w:ascii="Arial" w:hAnsi="Arial"/>
           <w:sz w:val="19"/>
         </w:rPr>
-        <w:t>Filename: Demo_Inspection_Guidelines.pdf | Page: 1 | Chunk Index: 0 | Document ID: 73311980-8338-4833-8e2e-246aa107a1eb</w:t>
+        <w:t>Filename: Demo_Safety_SOP.pdf | Page: 1 | Chunk Index: 0 | Document ID: 976c23dc-99fb-4626-8072-a9904200c0e6</w:t>
+      </w:r>
+    </w:p>
+    <w:p>
+      <w:pPr>
+        <w:spacing w:after="80"/>
+        <w:ind w:left="360"/>
+      </w:pPr>
+      <w:r>
+        <w:rPr>
+          <w:rFonts w:ascii="Arial" w:hAnsi="Arial"/>
+          <w:b/>
+          <w:sz w:val="19"/>
+        </w:rPr>
+        <w:t xml:space="preserve">[3] </w:t>
+      </w:r>
+      <w:r>
+        <w:rPr>
+          <w:rFonts w:ascii="Arial" w:hAnsi="Arial"/>
+          <w:sz w:val="19"/>
+        </w:rPr>
+        <w:t>Filename: Demo_Safety_SOP.pdf | Page: 2 | Chunk Index: 1 | Document ID: 976c23dc-99fb-4626-8072-a9904200c0e6</w:t>
       </w:r>
     </w:p>
     <w:p>

</xml_diff>

<commit_message>
feat: implement organization-level multi-tenancy and add comprehensive RAG hardening benchmarks and reports.
</commit_message>
<xml_diff>
--- a/backend/generated/Approval_Note_127a43a0-a49f-434e-8deb-2fb106d1f599.docx
+++ b/backend/generated/Approval_Note_127a43a0-a49f-434e-8deb-2fb106d1f599.docx
@@ -83,7 +83,7 @@
           <w:rFonts w:ascii="Arial" w:hAnsi="Arial"/>
           <w:sz w:val="20"/>
         </w:rPr>
-        <w:t>An industrial inspection identified 4 finding(s) on P-101. Operational parameters were recorded during standard inspection routines and evaluated against documented standard operating procedures (SOPs) to produce this assessment.</w:t>
+        <w:t>An industrial inspection identified 4 finding(s) on P-101 Process Pump. Operational parameters were recorded during standard inspection routines and evaluated against documented standard operating procedures (SOPs) to produce this assessment.</w:t>
       </w:r>
     </w:p>
     <w:p>
@@ -226,7 +226,7 @@
                 <w:rFonts w:ascii="Arial" w:hAnsi="Arial"/>
                 <w:sz w:val="19"/>
               </w:rPr>
-              <w:t>P-101</w:t>
+              <w:t>P-101 Process Pump</w:t>
             </w:r>
           </w:p>
         </w:tc>
@@ -434,7 +434,7 @@
                 <w:rFonts w:ascii="Arial" w:hAnsi="Arial"/>
                 <w:sz w:val="19"/>
               </w:rPr>
-              <w:t>The observed temperature and vibration values were recorded against equipment P-101. The bearing temperature was recorded above the normal operating limit.</w:t>
+              <w:t>The observed bearing temperature was recorded above the normal operating limit.</w:t>
             </w:r>
           </w:p>
         </w:tc>
@@ -570,7 +570,7 @@
                 <w:rFonts w:ascii="Arial" w:hAnsi="Arial"/>
                 <w:sz w:val="19"/>
               </w:rPr>
-              <w:t>P-101</w:t>
+              <w:t>P-101 Process Pump</w:t>
             </w:r>
           </w:p>
         </w:tc>
@@ -914,7 +914,7 @@
                 <w:rFonts w:ascii="Arial" w:hAnsi="Arial"/>
                 <w:sz w:val="19"/>
               </w:rPr>
-              <w:t>P-101</w:t>
+              <w:t>P-101 Process Pump</w:t>
             </w:r>
           </w:p>
         </w:tc>
@@ -1122,7 +1122,7 @@
                 <w:rFonts w:ascii="Arial" w:hAnsi="Arial"/>
                 <w:sz w:val="19"/>
               </w:rPr>
-              <w:t>The bearing area showed signs of inadequate lubrication.</w:t>
+              <w:t>Low / insufficient grease observed Adequate lubrication required</w:t>
             </w:r>
           </w:p>
         </w:tc>
@@ -1206,7 +1206,7 @@
                 <w:rFonts w:ascii="Arial" w:hAnsi="Arial"/>
                 <w:sz w:val="19"/>
               </w:rPr>
-              <w:t>Equipment kept out of normal service</w:t>
+              <w:t>Oil leakage</w:t>
             </w:r>
           </w:p>
         </w:tc>
@@ -1258,7 +1258,7 @@
                 <w:rFonts w:ascii="Arial" w:hAnsi="Arial"/>
                 <w:sz w:val="19"/>
               </w:rPr>
-              <w:t>P-101</w:t>
+              <w:t>P-101 Process Pump</w:t>
             </w:r>
           </w:p>
         </w:tc>
@@ -1310,7 +1310,7 @@
                 <w:rFonts w:ascii="Arial" w:hAnsi="Arial"/>
                 <w:sz w:val="19"/>
               </w:rPr>
-              <w:t>N/A</w:t>
+              <w:t>No visible leakage</w:t>
             </w:r>
           </w:p>
         </w:tc>
@@ -1362,7 +1362,7 @@
                 <w:rFonts w:ascii="Arial" w:hAnsi="Arial"/>
                 <w:sz w:val="19"/>
               </w:rPr>
-              <w:t>N/A</w:t>
+              <w:t>Up to no visible leakage</w:t>
             </w:r>
           </w:p>
         </w:tc>
@@ -1414,7 +1414,7 @@
                 <w:rFonts w:ascii="Arial" w:hAnsi="Arial"/>
                 <w:sz w:val="19"/>
               </w:rPr>
-              <w:t>N/A</w:t>
+              <w:t>NORMAL</w:t>
             </w:r>
           </w:p>
         </w:tc>
@@ -1466,7 +1466,7 @@
                 <w:rFonts w:ascii="Arial" w:hAnsi="Arial"/>
                 <w:sz w:val="19"/>
               </w:rPr>
-              <w:t>The equipment was kept out of normal service pending inspection and corrective action.</w:t>
+              <w:t>No visible leakage No visible leakage</w:t>
             </w:r>
           </w:p>
         </w:tc>
@@ -1501,7 +1501,7 @@
           <w:rFonts w:ascii="Arial" w:hAnsi="Arial"/>
           <w:sz w:val="20"/>
         </w:rPr>
-        <w:t>Evaluation was performed by correlating observed parameters against standard operating procedures (Demo_Safety_SOP.pdf, Demo_Maintenance_SOP.pdf). Assessment analysis indicates: The observed bearing temperature (92 °C) is above the normal operating limit (80 °C), but the SOP EVIDENCE does not explicitly state consequences for temperatures within the 80-90 °C range, and no indication of imminent danger is provided.</w:t>
+        <w:t>Evaluation was performed by correlating observed parameters against standard operating procedures (Demo_Maintenance_SOP.pdf, Maintenance_SOP.pdf). Assessment analysis indicates: Observed bearing temperature (92 °C) exceeded the normal operating limit (up to 80 °C) and the procedure instructs to record temperature and inspect bearing immediately.</w:t>
       </w:r>
     </w:p>
     <w:p>
@@ -1556,7 +1556,7 @@
         <w:tc>
           <w:tcPr>
             <w:tcW w:type="dxa" w:w="6768"/>
-            <w:shd w:fill="C6F6D5"/>
+            <w:shd w:fill="FED7D7"/>
             <w:tcMar>
               <w:top w:w="80" w:type="dxa"/>
               <w:bottom w:w="80" w:type="dxa"/>
@@ -1569,10 +1569,10 @@
               <w:rPr>
                 <w:rFonts w:ascii="Arial" w:hAnsi="Arial"/>
                 <w:b/>
-                <w:color w:val="287465"/>
+                <w:color w:val="C53030"/>
                 <w:sz w:val="22"/>
               </w:rPr>
-              <w:t>LOW</w:t>
+              <w:t>HIGH</w:t>
             </w:r>
           </w:p>
         </w:tc>
@@ -1617,7 +1617,7 @@
                 <w:rFonts w:ascii="Arial" w:hAnsi="Arial"/>
                 <w:sz w:val="19"/>
               </w:rPr>
-              <w:t>The observed bearing temperature (92 °C) is above the normal operating limit (80 °C), but the SOP EVIDENCE does not explicitly state consequences for temperatures within the 80-90 °C range, and no indication of imminent danger is provided.</w:t>
+              <w:t>Observed bearing temperature (92 °C) exceeded the normal operating limit (up to 80 °C) and the procedure instructs to record temperature and inspect bearing immediately.</w:t>
             </w:r>
           </w:p>
         </w:tc>
@@ -1675,7 +1675,7 @@
                 <w:color w:val="2B6CB0"/>
                 <w:sz w:val="20"/>
               </w:rPr>
-              <w:t>Record the observed temperature and inspect the bearing assembly, check lubrication condition, and check for abnormal vibration. Perform lockout/tagout procedure and inspect the bearing assembly, check lubrication condition, and check for abnormal vibration to determine the cause of the abnormal vibration and take corrective action to prevent future occurrences. Improve lubrication condition by applying adequate grease to the bearing area, and schedule regular maintenance to ensure the lubrication system is functioning correctly. Immediate inspection and corrective action should be performed on the P-101 equipment to ensure it is operating within normal limits and safely. This may include lubrication checks, bearing assembly inspection, and vibration analysis. The lockout/tagout procedure should also be reviewed and updated to ensure it aligns with the latest safety standards and regulations.</w:t>
+              <w:t>Schedule a maintenance inspection for the P-101 Process Pump bearing as soon as possible, and do not return the equipment to service until the inspection is complete. Perform immediate inspection of the pump bearing housing, check lubrication condition, and verify bearing temperature. If bearing temperature exceeds 80 degrees C, do not return equipment to service until inspection is complete. Check and top off lubrication condition immediately. Verify bearing temperature is within the acceptable range (&lt;80 degrees C). If bearing temperature exceeds 80 degrees C, record temperature and inspect bearing assembly, check lubrication condition, and check for abnormal vibration. Verify that the bearing temperature for the P-101 Process Pump is within the normal operating range of up to 80 degrees C.</w:t>
             </w:r>
           </w:p>
         </w:tc>
@@ -1719,7 +1719,7 @@
           <w:rFonts w:ascii="Arial" w:hAnsi="Arial"/>
           <w:sz w:val="19"/>
         </w:rPr>
-        <w:t>Filename: Demo_Maintenance_SOP.pdf | Page: 1 | Chunk Index: 0 | Document ID: 4b1c1b6e-ad6b-4169-9f90-944459337c0e</w:t>
+        <w:t>Filename: Maintenance_SOP.pdf | Page: 1 | Chunk Index: 0 | Document ID: doc_5d2f4720</w:t>
       </w:r>
     </w:p>
     <w:p>
@@ -1740,28 +1740,7 @@
           <w:rFonts w:ascii="Arial" w:hAnsi="Arial"/>
           <w:sz w:val="19"/>
         </w:rPr>
-        <w:t>Filename: Demo_Safety_SOP.pdf | Page: 1 | Chunk Index: 0 | Document ID: 976c23dc-99fb-4626-8072-a9904200c0e6</w:t>
-      </w:r>
-    </w:p>
-    <w:p>
-      <w:pPr>
-        <w:spacing w:after="80"/>
-        <w:ind w:left="360"/>
-      </w:pPr>
-      <w:r>
-        <w:rPr>
-          <w:rFonts w:ascii="Arial" w:hAnsi="Arial"/>
-          <w:b/>
-          <w:sz w:val="19"/>
-        </w:rPr>
-        <w:t xml:space="preserve">[3] </w:t>
-      </w:r>
-      <w:r>
-        <w:rPr>
-          <w:rFonts w:ascii="Arial" w:hAnsi="Arial"/>
-          <w:sz w:val="19"/>
-        </w:rPr>
-        <w:t>Filename: Demo_Safety_SOP.pdf | Page: 2 | Chunk Index: 1 | Document ID: 976c23dc-99fb-4626-8072-a9904200c0e6</w:t>
+        <w:t>Filename: Demo_Maintenance_SOP.pdf | Page: 1 | Chunk Index: 0 | Document ID: 4b1c1b6e-ad6b-4169-9f90-944459337c0e</w:t>
       </w:r>
     </w:p>
     <w:p>

</xml_diff>

<commit_message>
feat: enforce mandatory authentication across all API routes and integrate organization scoping
</commit_message>
<xml_diff>
--- a/backend/generated/Approval_Note_127a43a0-a49f-434e-8deb-2fb106d1f599.docx
+++ b/backend/generated/Approval_Note_127a43a0-a49f-434e-8deb-2fb106d1f599.docx
@@ -83,7 +83,7 @@
           <w:rFonts w:ascii="Arial" w:hAnsi="Arial"/>
           <w:sz w:val="20"/>
         </w:rPr>
-        <w:t>An industrial inspection identified 4 finding(s) on P-101. Operational parameters were recorded during standard inspection routines and evaluated against documented standard operating procedures (SOPs) to produce this assessment.</w:t>
+        <w:t>An industrial inspection identified 5 finding(s) on P-101. Operational parameters were recorded during standard inspection routines and evaluated against documented standard operating procedures (SOPs) to produce this assessment.</w:t>
       </w:r>
     </w:p>
     <w:p>
@@ -174,7 +174,7 @@
                 <w:rFonts w:ascii="Arial" w:hAnsi="Arial"/>
                 <w:sz w:val="19"/>
               </w:rPr>
-              <w:t>ABNORMAL Bearing temperature exceeded the normal operating limit.</w:t>
+              <w:t>Abnormal bearing temperature</w:t>
             </w:r>
           </w:p>
         </w:tc>
@@ -434,7 +434,7 @@
                 <w:rFonts w:ascii="Arial" w:hAnsi="Arial"/>
                 <w:sz w:val="19"/>
               </w:rPr>
-              <w:t>The observed bearing temperature was 92 °C. The applicable synthetic maintenance SOP states that normal bearing operating temperature is up to 80 °C. The reading therefore exceeds the documented limit by 12 °C.</w:t>
+              <w:t>The observed temperature and vibration values were recorded against equipment P-101. The bearing temperature was recorded above the normal operating limit.</w:t>
             </w:r>
           </w:p>
         </w:tc>
@@ -518,7 +518,7 @@
                 <w:rFonts w:ascii="Arial" w:hAnsi="Arial"/>
                 <w:sz w:val="19"/>
               </w:rPr>
-              <w:t>ABNORMAL Vibration was recorded.</w:t>
+              <w:t>Abnormal vibration</w:t>
             </w:r>
           </w:p>
         </w:tc>
@@ -862,7 +862,7 @@
                 <w:rFonts w:ascii="Arial" w:hAnsi="Arial"/>
                 <w:sz w:val="19"/>
               </w:rPr>
-              <w:t>ABNORMAL Lubrication condition was observed.</w:t>
+              <w:t>Abnormal lubrication condition</w:t>
             </w:r>
           </w:p>
         </w:tc>
@@ -1122,7 +1122,7 @@
                 <w:rFonts w:ascii="Arial" w:hAnsi="Arial"/>
                 <w:sz w:val="19"/>
               </w:rPr>
-              <w:t>Low / insufficient grease observed Adequate lubrication required</w:t>
+              <w:t>The affected maintenance area was identified for controlled inspection. The affected maintenance area was identified for controlled inspection.</w:t>
             </w:r>
           </w:p>
         </w:tc>
@@ -1206,7 +1206,7 @@
                 <w:rFonts w:ascii="Arial" w:hAnsi="Arial"/>
                 <w:sz w:val="19"/>
               </w:rPr>
-              <w:t>Equipment should remain under controlled maintenance review until the bearing condition has been inspected and corrective actions have been completed in accordance with the applicable company procedures.</w:t>
+              <w:t>Abnormal oil leakage</w:t>
             </w:r>
           </w:p>
         </w:tc>
@@ -1310,7 +1310,7 @@
                 <w:rFonts w:ascii="Arial" w:hAnsi="Arial"/>
                 <w:sz w:val="19"/>
               </w:rPr>
-              <w:t>N/A</w:t>
+              <w:t>No visible leakage</w:t>
             </w:r>
           </w:p>
         </w:tc>
@@ -1362,7 +1362,7 @@
                 <w:rFonts w:ascii="Arial" w:hAnsi="Arial"/>
                 <w:sz w:val="19"/>
               </w:rPr>
-              <w:t>N/A</w:t>
+              <w:t>No visible leakage</w:t>
             </w:r>
           </w:p>
         </w:tc>
@@ -1414,7 +1414,7 @@
                 <w:rFonts w:ascii="Arial" w:hAnsi="Arial"/>
                 <w:sz w:val="19"/>
               </w:rPr>
-              <w:t>N/A</w:t>
+              <w:t>NORMAL</w:t>
             </w:r>
           </w:p>
         </w:tc>
@@ -1466,7 +1466,351 @@
                 <w:rFonts w:ascii="Arial" w:hAnsi="Arial"/>
                 <w:sz w:val="19"/>
               </w:rPr>
-              <w:t>The inspection identified abnormal bearing temperature, elevated vibration, and inadequate lubrication on P-101. The equipment should remain under controlled maintenance review until the bearing condition has been inspected and corrective actions have been completed in accordance with the applicable company procedures.</w:t>
+              <w:t>Abnormal vibration was recorded. Vibration at the pump bearing housing was measured at 6.8 mm/s RMS, compared with the synthetic inspection criterion of 4.5 mm/s RMS.</w:t>
+            </w:r>
+          </w:p>
+        </w:tc>
+      </w:tr>
+    </w:tbl>
+    <w:p>
+      <w:pPr>
+        <w:spacing w:before="0" w:after="120"/>
+      </w:pPr>
+    </w:p>
+    <w:p>
+      <w:pPr>
+        <w:keepNext/>
+        <w:spacing w:before="120" w:after="80"/>
+      </w:pPr>
+      <w:r>
+        <w:rPr>
+          <w:rFonts w:ascii="Arial" w:hAnsi="Arial"/>
+          <w:b/>
+          <w:color w:val="2D3748"/>
+          <w:sz w:val="22"/>
+        </w:rPr>
+        <w:t>Finding 5</w:t>
+      </w:r>
+    </w:p>
+    <w:tbl>
+      <w:tblPr>
+        <w:tblW w:type="auto" w:w="0"/>
+        <w:jc w:val="center"/>
+        <w:tblLayout w:type="fixed"/>
+        <w:tblLook w:firstColumn="1" w:firstRow="1" w:lastColumn="0" w:lastRow="0" w:noHBand="0" w:noVBand="1" w:val="04A0"/>
+      </w:tblPr>
+      <w:tblGrid>
+        <w:gridCol w:w="4680"/>
+        <w:gridCol w:w="4680"/>
+      </w:tblGrid>
+      <w:tr>
+        <w:tc>
+          <w:tcPr>
+            <w:tcW w:type="dxa" w:w="2592"/>
+            <w:shd w:fill="EDF2F7"/>
+            <w:tcMar>
+              <w:top w:w="70" w:type="dxa"/>
+              <w:bottom w:w="70" w:type="dxa"/>
+              <w:left w:w="100" w:type="dxa"/>
+              <w:right w:w="100" w:type="dxa"/>
+            </w:tcMar>
+          </w:tcPr>
+          <w:p>
+            <w:pPr>
+              <w:spacing w:before="40" w:after="40"/>
+            </w:pPr>
+            <w:r>
+              <w:rPr>
+                <w:rFonts w:ascii="Arial" w:hAnsi="Arial"/>
+                <w:b/>
+                <w:color w:val="2D3748"/>
+                <w:sz w:val="19"/>
+              </w:rPr>
+              <w:t>Finding</w:t>
+            </w:r>
+          </w:p>
+        </w:tc>
+        <w:tc>
+          <w:tcPr>
+            <w:tcW w:type="dxa" w:w="6768"/>
+            <w:shd w:fill="FFFFFF"/>
+            <w:tcMar>
+              <w:top w:w="70" w:type="dxa"/>
+              <w:bottom w:w="70" w:type="dxa"/>
+              <w:left w:w="100" w:type="dxa"/>
+              <w:right w:w="100" w:type="dxa"/>
+            </w:tcMar>
+          </w:tcPr>
+          <w:p>
+            <w:pPr>
+              <w:spacing w:before="40" w:after="40"/>
+            </w:pPr>
+            <w:r>
+              <w:rPr>
+                <w:rFonts w:ascii="Arial" w:hAnsi="Arial"/>
+                <w:sz w:val="19"/>
+              </w:rPr>
+              <w:t>Inadequate lubrication</w:t>
+            </w:r>
+          </w:p>
+        </w:tc>
+      </w:tr>
+      <w:tr>
+        <w:tc>
+          <w:tcPr>
+            <w:tcW w:type="dxa" w:w="2592"/>
+            <w:shd w:fill="EDF2F7"/>
+            <w:tcMar>
+              <w:top w:w="70" w:type="dxa"/>
+              <w:bottom w:w="70" w:type="dxa"/>
+              <w:left w:w="100" w:type="dxa"/>
+              <w:right w:w="100" w:type="dxa"/>
+            </w:tcMar>
+          </w:tcPr>
+          <w:p>
+            <w:pPr>
+              <w:spacing w:before="40" w:after="40"/>
+            </w:pPr>
+            <w:r>
+              <w:rPr>
+                <w:rFonts w:ascii="Arial" w:hAnsi="Arial"/>
+                <w:b/>
+                <w:color w:val="2D3748"/>
+                <w:sz w:val="19"/>
+              </w:rPr>
+              <w:t>Equipment</w:t>
+            </w:r>
+          </w:p>
+        </w:tc>
+        <w:tc>
+          <w:tcPr>
+            <w:tcW w:type="dxa" w:w="6768"/>
+            <w:shd w:fill="FFFFFF"/>
+            <w:tcMar>
+              <w:top w:w="70" w:type="dxa"/>
+              <w:bottom w:w="70" w:type="dxa"/>
+              <w:left w:w="100" w:type="dxa"/>
+              <w:right w:w="100" w:type="dxa"/>
+            </w:tcMar>
+          </w:tcPr>
+          <w:p>
+            <w:pPr>
+              <w:spacing w:before="40" w:after="40"/>
+            </w:pPr>
+            <w:r>
+              <w:rPr>
+                <w:rFonts w:ascii="Arial" w:hAnsi="Arial"/>
+                <w:sz w:val="19"/>
+              </w:rPr>
+              <w:t>P-101</w:t>
+            </w:r>
+          </w:p>
+        </w:tc>
+      </w:tr>
+      <w:tr>
+        <w:tc>
+          <w:tcPr>
+            <w:tcW w:type="dxa" w:w="2592"/>
+            <w:shd w:fill="EDF2F7"/>
+            <w:tcMar>
+              <w:top w:w="70" w:type="dxa"/>
+              <w:bottom w:w="70" w:type="dxa"/>
+              <w:left w:w="100" w:type="dxa"/>
+              <w:right w:w="100" w:type="dxa"/>
+            </w:tcMar>
+          </w:tcPr>
+          <w:p>
+            <w:pPr>
+              <w:spacing w:before="40" w:after="40"/>
+            </w:pPr>
+            <w:r>
+              <w:rPr>
+                <w:rFonts w:ascii="Arial" w:hAnsi="Arial"/>
+                <w:b/>
+                <w:color w:val="2D3748"/>
+                <w:sz w:val="19"/>
+              </w:rPr>
+              <w:t>Observed Value</w:t>
+            </w:r>
+          </w:p>
+        </w:tc>
+        <w:tc>
+          <w:tcPr>
+            <w:tcW w:type="dxa" w:w="6768"/>
+            <w:shd w:fill="FFFFFF"/>
+            <w:tcMar>
+              <w:top w:w="70" w:type="dxa"/>
+              <w:bottom w:w="70" w:type="dxa"/>
+              <w:left w:w="100" w:type="dxa"/>
+              <w:right w:w="100" w:type="dxa"/>
+            </w:tcMar>
+          </w:tcPr>
+          <w:p>
+            <w:pPr>
+              <w:spacing w:before="40" w:after="40"/>
+            </w:pPr>
+            <w:r>
+              <w:rPr>
+                <w:rFonts w:ascii="Arial" w:hAnsi="Arial"/>
+                <w:sz w:val="19"/>
+              </w:rPr>
+              <w:t>Low / insufficient grease</w:t>
+            </w:r>
+          </w:p>
+        </w:tc>
+      </w:tr>
+      <w:tr>
+        <w:tc>
+          <w:tcPr>
+            <w:tcW w:type="dxa" w:w="2592"/>
+            <w:shd w:fill="EDF2F7"/>
+            <w:tcMar>
+              <w:top w:w="70" w:type="dxa"/>
+              <w:bottom w:w="70" w:type="dxa"/>
+              <w:left w:w="100" w:type="dxa"/>
+              <w:right w:w="100" w:type="dxa"/>
+            </w:tcMar>
+          </w:tcPr>
+          <w:p>
+            <w:pPr>
+              <w:spacing w:before="40" w:after="40"/>
+            </w:pPr>
+            <w:r>
+              <w:rPr>
+                <w:rFonts w:ascii="Arial" w:hAnsi="Arial"/>
+                <w:b/>
+                <w:color w:val="2D3748"/>
+                <w:sz w:val="19"/>
+              </w:rPr>
+              <w:t>Limit</w:t>
+            </w:r>
+          </w:p>
+        </w:tc>
+        <w:tc>
+          <w:tcPr>
+            <w:tcW w:type="dxa" w:w="6768"/>
+            <w:shd w:fill="FFFFFF"/>
+            <w:tcMar>
+              <w:top w:w="70" w:type="dxa"/>
+              <w:bottom w:w="70" w:type="dxa"/>
+              <w:left w:w="100" w:type="dxa"/>
+              <w:right w:w="100" w:type="dxa"/>
+            </w:tcMar>
+          </w:tcPr>
+          <w:p>
+            <w:pPr>
+              <w:spacing w:before="40" w:after="40"/>
+            </w:pPr>
+            <w:r>
+              <w:rPr>
+                <w:rFonts w:ascii="Arial" w:hAnsi="Arial"/>
+                <w:sz w:val="19"/>
+              </w:rPr>
+              <w:t>Adequate lubrication required</w:t>
+            </w:r>
+          </w:p>
+        </w:tc>
+      </w:tr>
+      <w:tr>
+        <w:tc>
+          <w:tcPr>
+            <w:tcW w:type="dxa" w:w="2592"/>
+            <w:shd w:fill="EDF2F7"/>
+            <w:tcMar>
+              <w:top w:w="70" w:type="dxa"/>
+              <w:bottom w:w="70" w:type="dxa"/>
+              <w:left w:w="100" w:type="dxa"/>
+              <w:right w:w="100" w:type="dxa"/>
+            </w:tcMar>
+          </w:tcPr>
+          <w:p>
+            <w:pPr>
+              <w:spacing w:before="40" w:after="40"/>
+            </w:pPr>
+            <w:r>
+              <w:rPr>
+                <w:rFonts w:ascii="Arial" w:hAnsi="Arial"/>
+                <w:b/>
+                <w:color w:val="2D3748"/>
+                <w:sz w:val="19"/>
+              </w:rPr>
+              <w:t>Severity</w:t>
+            </w:r>
+          </w:p>
+        </w:tc>
+        <w:tc>
+          <w:tcPr>
+            <w:tcW w:type="dxa" w:w="6768"/>
+            <w:shd w:fill="FFFFFF"/>
+            <w:tcMar>
+              <w:top w:w="70" w:type="dxa"/>
+              <w:bottom w:w="70" w:type="dxa"/>
+              <w:left w:w="100" w:type="dxa"/>
+              <w:right w:w="100" w:type="dxa"/>
+            </w:tcMar>
+          </w:tcPr>
+          <w:p>
+            <w:pPr>
+              <w:spacing w:before="40" w:after="40"/>
+            </w:pPr>
+            <w:r>
+              <w:rPr>
+                <w:rFonts w:ascii="Arial" w:hAnsi="Arial"/>
+                <w:sz w:val="19"/>
+              </w:rPr>
+              <w:t>ABNORMAL</w:t>
+            </w:r>
+          </w:p>
+        </w:tc>
+      </w:tr>
+      <w:tr>
+        <w:tc>
+          <w:tcPr>
+            <w:tcW w:type="dxa" w:w="2592"/>
+            <w:shd w:fill="EDF2F7"/>
+            <w:tcMar>
+              <w:top w:w="70" w:type="dxa"/>
+              <w:bottom w:w="70" w:type="dxa"/>
+              <w:left w:w="100" w:type="dxa"/>
+              <w:right w:w="100" w:type="dxa"/>
+            </w:tcMar>
+          </w:tcPr>
+          <w:p>
+            <w:pPr>
+              <w:spacing w:before="40" w:after="40"/>
+            </w:pPr>
+            <w:r>
+              <w:rPr>
+                <w:rFonts w:ascii="Arial" w:hAnsi="Arial"/>
+                <w:b/>
+                <w:color w:val="2D3748"/>
+                <w:sz w:val="19"/>
+              </w:rPr>
+              <w:t>Evidence</w:t>
+            </w:r>
+          </w:p>
+        </w:tc>
+        <w:tc>
+          <w:tcPr>
+            <w:tcW w:type="dxa" w:w="6768"/>
+            <w:shd w:fill="FFFFFF"/>
+            <w:tcMar>
+              <w:top w:w="70" w:type="dxa"/>
+              <w:bottom w:w="70" w:type="dxa"/>
+              <w:left w:w="100" w:type="dxa"/>
+              <w:right w:w="100" w:type="dxa"/>
+            </w:tcMar>
+          </w:tcPr>
+          <w:p>
+            <w:pPr>
+              <w:spacing w:before="40" w:after="40"/>
+            </w:pPr>
+            <w:r>
+              <w:rPr>
+                <w:rFonts w:ascii="Arial" w:hAnsi="Arial"/>
+                <w:sz w:val="19"/>
+              </w:rPr>
+              <w:t>The affected maintenance area was identified for controlled inspection. The affected maintenance area was identified for controlled inspection.</w:t>
             </w:r>
           </w:p>
         </w:tc>
@@ -1501,7 +1845,7 @@
           <w:rFonts w:ascii="Arial" w:hAnsi="Arial"/>
           <w:sz w:val="20"/>
         </w:rPr>
-        <w:t>Evaluation was performed by correlating observed parameters against standard operating procedures (Demo_Inspection_Guidelines.pdf, Demo_Maintenance_SOP.pdf). Assessment analysis indicates: The observed bearing temperature (92 °C) exceeds the documented limit of 80 °C, indicating a potential for equipment damage or failure.</w:t>
+        <w:t>Evaluation was performed by correlating observed parameters against standard operating procedures (Maintenance_SOP.pdf, Demo_Maintenance_SOP.pdf). Assessment analysis indicates: The observed bearing temperature of 92 °C exceeds the normal operating limit of up to 80 °C, indicating a potential risk to equipment and process safety.</w:t>
       </w:r>
     </w:p>
     <w:p>
@@ -1617,7 +1961,7 @@
                 <w:rFonts w:ascii="Arial" w:hAnsi="Arial"/>
                 <w:sz w:val="19"/>
               </w:rPr>
-              <w:t>The observed bearing temperature (92 °C) exceeds the documented limit of 80 °C, indicating a potential for equipment damage or failure.</w:t>
+              <w:t>The observed bearing temperature of 92 °C exceeds the normal operating limit of up to 80 °C, indicating a potential risk to equipment and process safety.</w:t>
             </w:r>
           </w:p>
         </w:tc>
@@ -1675,7 +2019,7 @@
                 <w:color w:val="2B6CB0"/>
                 <w:sz w:val="20"/>
               </w:rPr>
-              <w:t>Inspect the bearing assembly, check lubrication condition, and check for abnormal vibration. Do not return the equipment to service until the inspection is complete. Record the observation, inspect the bearing assembly, check lubrication condition, and check for abnormal vibration. Do not return equipment to service until inspection is complete. Conduct an immediate bearing inspection and apply adequate lubrication condition to prevent further damage. Schedule an immediate bearing inspection and corrective actions to be completed in accordance with the applicable company procedures for P-101.</w:t>
+              <w:t>Inspect the bearing assembly, check lubrication condition, and check for abnormal vibration. Do not return equipment to service until inspection is complete. Schedule an immediate bearing inspection and lubrication check, and do not return the equipment to service until the issue is resolved. Schedule a bearing inspection and lubrication check for P-101 as soon as possible to prevent potential damage or failure. Schedule a bearing inspection and lubrication check to ensure the pump is operating within normal parameters. Check and replenish lubrication in P-101 equipment as soon as possible, following the approved maintenance procedure to prevent further damage or risk to the equipment.</w:t>
             </w:r>
           </w:p>
         </w:tc>
@@ -1740,28 +2084,7 @@
           <w:rFonts w:ascii="Arial" w:hAnsi="Arial"/>
           <w:sz w:val="19"/>
         </w:rPr>
-        <w:t>Filename: Demo_Inspection_Guidelines.pdf | Page: 1 | Chunk Index: 0 | Document ID: d450bd44-c57e-4fe8-a141-84a1af9d8063</w:t>
-      </w:r>
-    </w:p>
-    <w:p>
-      <w:pPr>
-        <w:spacing w:after="80"/>
-        <w:ind w:left="360"/>
-      </w:pPr>
-      <w:r>
-        <w:rPr>
-          <w:rFonts w:ascii="Arial" w:hAnsi="Arial"/>
-          <w:b/>
-          <w:sz w:val="19"/>
-        </w:rPr>
-        <w:t xml:space="preserve">[3] </w:t>
-      </w:r>
-      <w:r>
-        <w:rPr>
-          <w:rFonts w:ascii="Arial" w:hAnsi="Arial"/>
-          <w:sz w:val="19"/>
-        </w:rPr>
-        <w:t>Filename: Demo_Maintenance_SOP.pdf | Page: 2 | Chunk Index: 1 | Document ID: c2fd4c4f-8d4e-406e-9bb2-7b3c6e94d9b5</w:t>
+        <w:t>Filename: Maintenance_SOP.pdf | Page: 1 | Chunk Index: 0 | Document ID: doc_5ffb032d</w:t>
       </w:r>
     </w:p>
     <w:p>

</xml_diff>

<commit_message>
refactor: enforce multi-tenant isolation by requiring organizationId in tool execution and file storage operations
</commit_message>
<xml_diff>
--- a/backend/generated/Approval_Note_127a43a0-a49f-434e-8deb-2fb106d1f599.docx
+++ b/backend/generated/Approval_Note_127a43a0-a49f-434e-8deb-2fb106d1f599.docx
@@ -83,7 +83,7 @@
           <w:rFonts w:ascii="Arial" w:hAnsi="Arial"/>
           <w:sz w:val="20"/>
         </w:rPr>
-        <w:t>An industrial inspection identified 5 finding(s) on P-101. Operational parameters were recorded during standard inspection routines and evaluated against documented standard operating procedures (SOPs) to produce this assessment.</w:t>
+        <w:t>An industrial inspection identified 2 finding(s) on P-101. Operational parameters were recorded during standard inspection routines and evaluated against documented standard operating procedures (SOPs) to produce this assessment.</w:t>
       </w:r>
     </w:p>
     <w:p>
@@ -434,7 +434,7 @@
                 <w:rFonts w:ascii="Arial" w:hAnsi="Arial"/>
                 <w:sz w:val="19"/>
               </w:rPr>
-              <w:t>The observed temperature and vibration values were recorded against equipment P-101. The bearing temperature was recorded above the normal operating limit.</w:t>
+              <w:t>The observed bearing temperature was 92 °C. The applicable synthetic maintenance SOP states that normal bearing operating temperature is up to 80 °C. The reading therefore exceeds the documented limit by 12 °C.</w:t>
             </w:r>
           </w:p>
         </w:tc>
@@ -792,1038 +792,6 @@
     <w:p>
       <w:pPr>
         <w:keepNext/>
-        <w:spacing w:before="120" w:after="80"/>
-      </w:pPr>
-      <w:r>
-        <w:rPr>
-          <w:rFonts w:ascii="Arial" w:hAnsi="Arial"/>
-          <w:b/>
-          <w:color w:val="2D3748"/>
-          <w:sz w:val="22"/>
-        </w:rPr>
-        <w:t>Finding 3</w:t>
-      </w:r>
-    </w:p>
-    <w:tbl>
-      <w:tblPr>
-        <w:tblW w:type="auto" w:w="0"/>
-        <w:jc w:val="center"/>
-        <w:tblLayout w:type="fixed"/>
-        <w:tblLook w:firstColumn="1" w:firstRow="1" w:lastColumn="0" w:lastRow="0" w:noHBand="0" w:noVBand="1" w:val="04A0"/>
-      </w:tblPr>
-      <w:tblGrid>
-        <w:gridCol w:w="4680"/>
-        <w:gridCol w:w="4680"/>
-      </w:tblGrid>
-      <w:tr>
-        <w:tc>
-          <w:tcPr>
-            <w:tcW w:type="dxa" w:w="2592"/>
-            <w:shd w:fill="EDF2F7"/>
-            <w:tcMar>
-              <w:top w:w="70" w:type="dxa"/>
-              <w:bottom w:w="70" w:type="dxa"/>
-              <w:left w:w="100" w:type="dxa"/>
-              <w:right w:w="100" w:type="dxa"/>
-            </w:tcMar>
-          </w:tcPr>
-          <w:p>
-            <w:pPr>
-              <w:spacing w:before="40" w:after="40"/>
-            </w:pPr>
-            <w:r>
-              <w:rPr>
-                <w:rFonts w:ascii="Arial" w:hAnsi="Arial"/>
-                <w:b/>
-                <w:color w:val="2D3748"/>
-                <w:sz w:val="19"/>
-              </w:rPr>
-              <w:t>Finding</w:t>
-            </w:r>
-          </w:p>
-        </w:tc>
-        <w:tc>
-          <w:tcPr>
-            <w:tcW w:type="dxa" w:w="6768"/>
-            <w:shd w:fill="FFFFFF"/>
-            <w:tcMar>
-              <w:top w:w="70" w:type="dxa"/>
-              <w:bottom w:w="70" w:type="dxa"/>
-              <w:left w:w="100" w:type="dxa"/>
-              <w:right w:w="100" w:type="dxa"/>
-            </w:tcMar>
-          </w:tcPr>
-          <w:p>
-            <w:pPr>
-              <w:spacing w:before="40" w:after="40"/>
-            </w:pPr>
-            <w:r>
-              <w:rPr>
-                <w:rFonts w:ascii="Arial" w:hAnsi="Arial"/>
-                <w:sz w:val="19"/>
-              </w:rPr>
-              <w:t>Abnormal lubrication condition</w:t>
-            </w:r>
-          </w:p>
-        </w:tc>
-      </w:tr>
-      <w:tr>
-        <w:tc>
-          <w:tcPr>
-            <w:tcW w:type="dxa" w:w="2592"/>
-            <w:shd w:fill="EDF2F7"/>
-            <w:tcMar>
-              <w:top w:w="70" w:type="dxa"/>
-              <w:bottom w:w="70" w:type="dxa"/>
-              <w:left w:w="100" w:type="dxa"/>
-              <w:right w:w="100" w:type="dxa"/>
-            </w:tcMar>
-          </w:tcPr>
-          <w:p>
-            <w:pPr>
-              <w:spacing w:before="40" w:after="40"/>
-            </w:pPr>
-            <w:r>
-              <w:rPr>
-                <w:rFonts w:ascii="Arial" w:hAnsi="Arial"/>
-                <w:b/>
-                <w:color w:val="2D3748"/>
-                <w:sz w:val="19"/>
-              </w:rPr>
-              <w:t>Equipment</w:t>
-            </w:r>
-          </w:p>
-        </w:tc>
-        <w:tc>
-          <w:tcPr>
-            <w:tcW w:type="dxa" w:w="6768"/>
-            <w:shd w:fill="FFFFFF"/>
-            <w:tcMar>
-              <w:top w:w="70" w:type="dxa"/>
-              <w:bottom w:w="70" w:type="dxa"/>
-              <w:left w:w="100" w:type="dxa"/>
-              <w:right w:w="100" w:type="dxa"/>
-            </w:tcMar>
-          </w:tcPr>
-          <w:p>
-            <w:pPr>
-              <w:spacing w:before="40" w:after="40"/>
-            </w:pPr>
-            <w:r>
-              <w:rPr>
-                <w:rFonts w:ascii="Arial" w:hAnsi="Arial"/>
-                <w:sz w:val="19"/>
-              </w:rPr>
-              <w:t>P-101</w:t>
-            </w:r>
-          </w:p>
-        </w:tc>
-      </w:tr>
-      <w:tr>
-        <w:tc>
-          <w:tcPr>
-            <w:tcW w:type="dxa" w:w="2592"/>
-            <w:shd w:fill="EDF2F7"/>
-            <w:tcMar>
-              <w:top w:w="70" w:type="dxa"/>
-              <w:bottom w:w="70" w:type="dxa"/>
-              <w:left w:w="100" w:type="dxa"/>
-              <w:right w:w="100" w:type="dxa"/>
-            </w:tcMar>
-          </w:tcPr>
-          <w:p>
-            <w:pPr>
-              <w:spacing w:before="40" w:after="40"/>
-            </w:pPr>
-            <w:r>
-              <w:rPr>
-                <w:rFonts w:ascii="Arial" w:hAnsi="Arial"/>
-                <w:b/>
-                <w:color w:val="2D3748"/>
-                <w:sz w:val="19"/>
-              </w:rPr>
-              <w:t>Observed Value</w:t>
-            </w:r>
-          </w:p>
-        </w:tc>
-        <w:tc>
-          <w:tcPr>
-            <w:tcW w:type="dxa" w:w="6768"/>
-            <w:shd w:fill="FFFFFF"/>
-            <w:tcMar>
-              <w:top w:w="70" w:type="dxa"/>
-              <w:bottom w:w="70" w:type="dxa"/>
-              <w:left w:w="100" w:type="dxa"/>
-              <w:right w:w="100" w:type="dxa"/>
-            </w:tcMar>
-          </w:tcPr>
-          <w:p>
-            <w:pPr>
-              <w:spacing w:before="40" w:after="40"/>
-            </w:pPr>
-            <w:r>
-              <w:rPr>
-                <w:rFonts w:ascii="Arial" w:hAnsi="Arial"/>
-                <w:sz w:val="19"/>
-              </w:rPr>
-              <w:t>Low / insufficient grease</w:t>
-            </w:r>
-          </w:p>
-        </w:tc>
-      </w:tr>
-      <w:tr>
-        <w:tc>
-          <w:tcPr>
-            <w:tcW w:type="dxa" w:w="2592"/>
-            <w:shd w:fill="EDF2F7"/>
-            <w:tcMar>
-              <w:top w:w="70" w:type="dxa"/>
-              <w:bottom w:w="70" w:type="dxa"/>
-              <w:left w:w="100" w:type="dxa"/>
-              <w:right w:w="100" w:type="dxa"/>
-            </w:tcMar>
-          </w:tcPr>
-          <w:p>
-            <w:pPr>
-              <w:spacing w:before="40" w:after="40"/>
-            </w:pPr>
-            <w:r>
-              <w:rPr>
-                <w:rFonts w:ascii="Arial" w:hAnsi="Arial"/>
-                <w:b/>
-                <w:color w:val="2D3748"/>
-                <w:sz w:val="19"/>
-              </w:rPr>
-              <w:t>Limit</w:t>
-            </w:r>
-          </w:p>
-        </w:tc>
-        <w:tc>
-          <w:tcPr>
-            <w:tcW w:type="dxa" w:w="6768"/>
-            <w:shd w:fill="FFFFFF"/>
-            <w:tcMar>
-              <w:top w:w="70" w:type="dxa"/>
-              <w:bottom w:w="70" w:type="dxa"/>
-              <w:left w:w="100" w:type="dxa"/>
-              <w:right w:w="100" w:type="dxa"/>
-            </w:tcMar>
-          </w:tcPr>
-          <w:p>
-            <w:pPr>
-              <w:spacing w:before="40" w:after="40"/>
-            </w:pPr>
-            <w:r>
-              <w:rPr>
-                <w:rFonts w:ascii="Arial" w:hAnsi="Arial"/>
-                <w:sz w:val="19"/>
-              </w:rPr>
-              <w:t>Adequate lubrication required</w:t>
-            </w:r>
-          </w:p>
-        </w:tc>
-      </w:tr>
-      <w:tr>
-        <w:tc>
-          <w:tcPr>
-            <w:tcW w:type="dxa" w:w="2592"/>
-            <w:shd w:fill="EDF2F7"/>
-            <w:tcMar>
-              <w:top w:w="70" w:type="dxa"/>
-              <w:bottom w:w="70" w:type="dxa"/>
-              <w:left w:w="100" w:type="dxa"/>
-              <w:right w:w="100" w:type="dxa"/>
-            </w:tcMar>
-          </w:tcPr>
-          <w:p>
-            <w:pPr>
-              <w:spacing w:before="40" w:after="40"/>
-            </w:pPr>
-            <w:r>
-              <w:rPr>
-                <w:rFonts w:ascii="Arial" w:hAnsi="Arial"/>
-                <w:b/>
-                <w:color w:val="2D3748"/>
-                <w:sz w:val="19"/>
-              </w:rPr>
-              <w:t>Severity</w:t>
-            </w:r>
-          </w:p>
-        </w:tc>
-        <w:tc>
-          <w:tcPr>
-            <w:tcW w:type="dxa" w:w="6768"/>
-            <w:shd w:fill="FFFFFF"/>
-            <w:tcMar>
-              <w:top w:w="70" w:type="dxa"/>
-              <w:bottom w:w="70" w:type="dxa"/>
-              <w:left w:w="100" w:type="dxa"/>
-              <w:right w:w="100" w:type="dxa"/>
-            </w:tcMar>
-          </w:tcPr>
-          <w:p>
-            <w:pPr>
-              <w:spacing w:before="40" w:after="40"/>
-            </w:pPr>
-            <w:r>
-              <w:rPr>
-                <w:rFonts w:ascii="Arial" w:hAnsi="Arial"/>
-                <w:sz w:val="19"/>
-              </w:rPr>
-              <w:t>ABNORMAL</w:t>
-            </w:r>
-          </w:p>
-        </w:tc>
-      </w:tr>
-      <w:tr>
-        <w:tc>
-          <w:tcPr>
-            <w:tcW w:type="dxa" w:w="2592"/>
-            <w:shd w:fill="EDF2F7"/>
-            <w:tcMar>
-              <w:top w:w="70" w:type="dxa"/>
-              <w:bottom w:w="70" w:type="dxa"/>
-              <w:left w:w="100" w:type="dxa"/>
-              <w:right w:w="100" w:type="dxa"/>
-            </w:tcMar>
-          </w:tcPr>
-          <w:p>
-            <w:pPr>
-              <w:spacing w:before="40" w:after="40"/>
-            </w:pPr>
-            <w:r>
-              <w:rPr>
-                <w:rFonts w:ascii="Arial" w:hAnsi="Arial"/>
-                <w:b/>
-                <w:color w:val="2D3748"/>
-                <w:sz w:val="19"/>
-              </w:rPr>
-              <w:t>Evidence</w:t>
-            </w:r>
-          </w:p>
-        </w:tc>
-        <w:tc>
-          <w:tcPr>
-            <w:tcW w:type="dxa" w:w="6768"/>
-            <w:shd w:fill="FFFFFF"/>
-            <w:tcMar>
-              <w:top w:w="70" w:type="dxa"/>
-              <w:bottom w:w="70" w:type="dxa"/>
-              <w:left w:w="100" w:type="dxa"/>
-              <w:right w:w="100" w:type="dxa"/>
-            </w:tcMar>
-          </w:tcPr>
-          <w:p>
-            <w:pPr>
-              <w:spacing w:before="40" w:after="40"/>
-            </w:pPr>
-            <w:r>
-              <w:rPr>
-                <w:rFonts w:ascii="Arial" w:hAnsi="Arial"/>
-                <w:sz w:val="19"/>
-              </w:rPr>
-              <w:t>The affected maintenance area was identified for controlled inspection. The affected maintenance area was identified for controlled inspection.</w:t>
-            </w:r>
-          </w:p>
-        </w:tc>
-      </w:tr>
-    </w:tbl>
-    <w:p>
-      <w:pPr>
-        <w:spacing w:before="0" w:after="120"/>
-      </w:pPr>
-    </w:p>
-    <w:p>
-      <w:pPr>
-        <w:keepNext/>
-        <w:spacing w:before="120" w:after="80"/>
-      </w:pPr>
-      <w:r>
-        <w:rPr>
-          <w:rFonts w:ascii="Arial" w:hAnsi="Arial"/>
-          <w:b/>
-          <w:color w:val="2D3748"/>
-          <w:sz w:val="22"/>
-        </w:rPr>
-        <w:t>Finding 4</w:t>
-      </w:r>
-    </w:p>
-    <w:tbl>
-      <w:tblPr>
-        <w:tblW w:type="auto" w:w="0"/>
-        <w:jc w:val="center"/>
-        <w:tblLayout w:type="fixed"/>
-        <w:tblLook w:firstColumn="1" w:firstRow="1" w:lastColumn="0" w:lastRow="0" w:noHBand="0" w:noVBand="1" w:val="04A0"/>
-      </w:tblPr>
-      <w:tblGrid>
-        <w:gridCol w:w="4680"/>
-        <w:gridCol w:w="4680"/>
-      </w:tblGrid>
-      <w:tr>
-        <w:tc>
-          <w:tcPr>
-            <w:tcW w:type="dxa" w:w="2592"/>
-            <w:shd w:fill="EDF2F7"/>
-            <w:tcMar>
-              <w:top w:w="70" w:type="dxa"/>
-              <w:bottom w:w="70" w:type="dxa"/>
-              <w:left w:w="100" w:type="dxa"/>
-              <w:right w:w="100" w:type="dxa"/>
-            </w:tcMar>
-          </w:tcPr>
-          <w:p>
-            <w:pPr>
-              <w:spacing w:before="40" w:after="40"/>
-            </w:pPr>
-            <w:r>
-              <w:rPr>
-                <w:rFonts w:ascii="Arial" w:hAnsi="Arial"/>
-                <w:b/>
-                <w:color w:val="2D3748"/>
-                <w:sz w:val="19"/>
-              </w:rPr>
-              <w:t>Finding</w:t>
-            </w:r>
-          </w:p>
-        </w:tc>
-        <w:tc>
-          <w:tcPr>
-            <w:tcW w:type="dxa" w:w="6768"/>
-            <w:shd w:fill="FFFFFF"/>
-            <w:tcMar>
-              <w:top w:w="70" w:type="dxa"/>
-              <w:bottom w:w="70" w:type="dxa"/>
-              <w:left w:w="100" w:type="dxa"/>
-              <w:right w:w="100" w:type="dxa"/>
-            </w:tcMar>
-          </w:tcPr>
-          <w:p>
-            <w:pPr>
-              <w:spacing w:before="40" w:after="40"/>
-            </w:pPr>
-            <w:r>
-              <w:rPr>
-                <w:rFonts w:ascii="Arial" w:hAnsi="Arial"/>
-                <w:sz w:val="19"/>
-              </w:rPr>
-              <w:t>Abnormal oil leakage</w:t>
-            </w:r>
-          </w:p>
-        </w:tc>
-      </w:tr>
-      <w:tr>
-        <w:tc>
-          <w:tcPr>
-            <w:tcW w:type="dxa" w:w="2592"/>
-            <w:shd w:fill="EDF2F7"/>
-            <w:tcMar>
-              <w:top w:w="70" w:type="dxa"/>
-              <w:bottom w:w="70" w:type="dxa"/>
-              <w:left w:w="100" w:type="dxa"/>
-              <w:right w:w="100" w:type="dxa"/>
-            </w:tcMar>
-          </w:tcPr>
-          <w:p>
-            <w:pPr>
-              <w:spacing w:before="40" w:after="40"/>
-            </w:pPr>
-            <w:r>
-              <w:rPr>
-                <w:rFonts w:ascii="Arial" w:hAnsi="Arial"/>
-                <w:b/>
-                <w:color w:val="2D3748"/>
-                <w:sz w:val="19"/>
-              </w:rPr>
-              <w:t>Equipment</w:t>
-            </w:r>
-          </w:p>
-        </w:tc>
-        <w:tc>
-          <w:tcPr>
-            <w:tcW w:type="dxa" w:w="6768"/>
-            <w:shd w:fill="FFFFFF"/>
-            <w:tcMar>
-              <w:top w:w="70" w:type="dxa"/>
-              <w:bottom w:w="70" w:type="dxa"/>
-              <w:left w:w="100" w:type="dxa"/>
-              <w:right w:w="100" w:type="dxa"/>
-            </w:tcMar>
-          </w:tcPr>
-          <w:p>
-            <w:pPr>
-              <w:spacing w:before="40" w:after="40"/>
-            </w:pPr>
-            <w:r>
-              <w:rPr>
-                <w:rFonts w:ascii="Arial" w:hAnsi="Arial"/>
-                <w:sz w:val="19"/>
-              </w:rPr>
-              <w:t>P-101</w:t>
-            </w:r>
-          </w:p>
-        </w:tc>
-      </w:tr>
-      <w:tr>
-        <w:tc>
-          <w:tcPr>
-            <w:tcW w:type="dxa" w:w="2592"/>
-            <w:shd w:fill="EDF2F7"/>
-            <w:tcMar>
-              <w:top w:w="70" w:type="dxa"/>
-              <w:bottom w:w="70" w:type="dxa"/>
-              <w:left w:w="100" w:type="dxa"/>
-              <w:right w:w="100" w:type="dxa"/>
-            </w:tcMar>
-          </w:tcPr>
-          <w:p>
-            <w:pPr>
-              <w:spacing w:before="40" w:after="40"/>
-            </w:pPr>
-            <w:r>
-              <w:rPr>
-                <w:rFonts w:ascii="Arial" w:hAnsi="Arial"/>
-                <w:b/>
-                <w:color w:val="2D3748"/>
-                <w:sz w:val="19"/>
-              </w:rPr>
-              <w:t>Observed Value</w:t>
-            </w:r>
-          </w:p>
-        </w:tc>
-        <w:tc>
-          <w:tcPr>
-            <w:tcW w:type="dxa" w:w="6768"/>
-            <w:shd w:fill="FFFFFF"/>
-            <w:tcMar>
-              <w:top w:w="70" w:type="dxa"/>
-              <w:bottom w:w="70" w:type="dxa"/>
-              <w:left w:w="100" w:type="dxa"/>
-              <w:right w:w="100" w:type="dxa"/>
-            </w:tcMar>
-          </w:tcPr>
-          <w:p>
-            <w:pPr>
-              <w:spacing w:before="40" w:after="40"/>
-            </w:pPr>
-            <w:r>
-              <w:rPr>
-                <w:rFonts w:ascii="Arial" w:hAnsi="Arial"/>
-                <w:sz w:val="19"/>
-              </w:rPr>
-              <w:t>No visible leakage</w:t>
-            </w:r>
-          </w:p>
-        </w:tc>
-      </w:tr>
-      <w:tr>
-        <w:tc>
-          <w:tcPr>
-            <w:tcW w:type="dxa" w:w="2592"/>
-            <w:shd w:fill="EDF2F7"/>
-            <w:tcMar>
-              <w:top w:w="70" w:type="dxa"/>
-              <w:bottom w:w="70" w:type="dxa"/>
-              <w:left w:w="100" w:type="dxa"/>
-              <w:right w:w="100" w:type="dxa"/>
-            </w:tcMar>
-          </w:tcPr>
-          <w:p>
-            <w:pPr>
-              <w:spacing w:before="40" w:after="40"/>
-            </w:pPr>
-            <w:r>
-              <w:rPr>
-                <w:rFonts w:ascii="Arial" w:hAnsi="Arial"/>
-                <w:b/>
-                <w:color w:val="2D3748"/>
-                <w:sz w:val="19"/>
-              </w:rPr>
-              <w:t>Limit</w:t>
-            </w:r>
-          </w:p>
-        </w:tc>
-        <w:tc>
-          <w:tcPr>
-            <w:tcW w:type="dxa" w:w="6768"/>
-            <w:shd w:fill="FFFFFF"/>
-            <w:tcMar>
-              <w:top w:w="70" w:type="dxa"/>
-              <w:bottom w:w="70" w:type="dxa"/>
-              <w:left w:w="100" w:type="dxa"/>
-              <w:right w:w="100" w:type="dxa"/>
-            </w:tcMar>
-          </w:tcPr>
-          <w:p>
-            <w:pPr>
-              <w:spacing w:before="40" w:after="40"/>
-            </w:pPr>
-            <w:r>
-              <w:rPr>
-                <w:rFonts w:ascii="Arial" w:hAnsi="Arial"/>
-                <w:sz w:val="19"/>
-              </w:rPr>
-              <w:t>No visible leakage</w:t>
-            </w:r>
-          </w:p>
-        </w:tc>
-      </w:tr>
-      <w:tr>
-        <w:tc>
-          <w:tcPr>
-            <w:tcW w:type="dxa" w:w="2592"/>
-            <w:shd w:fill="EDF2F7"/>
-            <w:tcMar>
-              <w:top w:w="70" w:type="dxa"/>
-              <w:bottom w:w="70" w:type="dxa"/>
-              <w:left w:w="100" w:type="dxa"/>
-              <w:right w:w="100" w:type="dxa"/>
-            </w:tcMar>
-          </w:tcPr>
-          <w:p>
-            <w:pPr>
-              <w:spacing w:before="40" w:after="40"/>
-            </w:pPr>
-            <w:r>
-              <w:rPr>
-                <w:rFonts w:ascii="Arial" w:hAnsi="Arial"/>
-                <w:b/>
-                <w:color w:val="2D3748"/>
-                <w:sz w:val="19"/>
-              </w:rPr>
-              <w:t>Severity</w:t>
-            </w:r>
-          </w:p>
-        </w:tc>
-        <w:tc>
-          <w:tcPr>
-            <w:tcW w:type="dxa" w:w="6768"/>
-            <w:shd w:fill="FFFFFF"/>
-            <w:tcMar>
-              <w:top w:w="70" w:type="dxa"/>
-              <w:bottom w:w="70" w:type="dxa"/>
-              <w:left w:w="100" w:type="dxa"/>
-              <w:right w:w="100" w:type="dxa"/>
-            </w:tcMar>
-          </w:tcPr>
-          <w:p>
-            <w:pPr>
-              <w:spacing w:before="40" w:after="40"/>
-            </w:pPr>
-            <w:r>
-              <w:rPr>
-                <w:rFonts w:ascii="Arial" w:hAnsi="Arial"/>
-                <w:sz w:val="19"/>
-              </w:rPr>
-              <w:t>NORMAL</w:t>
-            </w:r>
-          </w:p>
-        </w:tc>
-      </w:tr>
-      <w:tr>
-        <w:tc>
-          <w:tcPr>
-            <w:tcW w:type="dxa" w:w="2592"/>
-            <w:shd w:fill="EDF2F7"/>
-            <w:tcMar>
-              <w:top w:w="70" w:type="dxa"/>
-              <w:bottom w:w="70" w:type="dxa"/>
-              <w:left w:w="100" w:type="dxa"/>
-              <w:right w:w="100" w:type="dxa"/>
-            </w:tcMar>
-          </w:tcPr>
-          <w:p>
-            <w:pPr>
-              <w:spacing w:before="40" w:after="40"/>
-            </w:pPr>
-            <w:r>
-              <w:rPr>
-                <w:rFonts w:ascii="Arial" w:hAnsi="Arial"/>
-                <w:b/>
-                <w:color w:val="2D3748"/>
-                <w:sz w:val="19"/>
-              </w:rPr>
-              <w:t>Evidence</w:t>
-            </w:r>
-          </w:p>
-        </w:tc>
-        <w:tc>
-          <w:tcPr>
-            <w:tcW w:type="dxa" w:w="6768"/>
-            <w:shd w:fill="FFFFFF"/>
-            <w:tcMar>
-              <w:top w:w="70" w:type="dxa"/>
-              <w:bottom w:w="70" w:type="dxa"/>
-              <w:left w:w="100" w:type="dxa"/>
-              <w:right w:w="100" w:type="dxa"/>
-            </w:tcMar>
-          </w:tcPr>
-          <w:p>
-            <w:pPr>
-              <w:spacing w:before="40" w:after="40"/>
-            </w:pPr>
-            <w:r>
-              <w:rPr>
-                <w:rFonts w:ascii="Arial" w:hAnsi="Arial"/>
-                <w:sz w:val="19"/>
-              </w:rPr>
-              <w:t>Abnormal vibration was recorded. Vibration at the pump bearing housing was measured at 6.8 mm/s RMS, compared with the synthetic inspection criterion of 4.5 mm/s RMS.</w:t>
-            </w:r>
-          </w:p>
-        </w:tc>
-      </w:tr>
-    </w:tbl>
-    <w:p>
-      <w:pPr>
-        <w:spacing w:before="0" w:after="120"/>
-      </w:pPr>
-    </w:p>
-    <w:p>
-      <w:pPr>
-        <w:keepNext/>
-        <w:spacing w:before="120" w:after="80"/>
-      </w:pPr>
-      <w:r>
-        <w:rPr>
-          <w:rFonts w:ascii="Arial" w:hAnsi="Arial"/>
-          <w:b/>
-          <w:color w:val="2D3748"/>
-          <w:sz w:val="22"/>
-        </w:rPr>
-        <w:t>Finding 5</w:t>
-      </w:r>
-    </w:p>
-    <w:tbl>
-      <w:tblPr>
-        <w:tblW w:type="auto" w:w="0"/>
-        <w:jc w:val="center"/>
-        <w:tblLayout w:type="fixed"/>
-        <w:tblLook w:firstColumn="1" w:firstRow="1" w:lastColumn="0" w:lastRow="0" w:noHBand="0" w:noVBand="1" w:val="04A0"/>
-      </w:tblPr>
-      <w:tblGrid>
-        <w:gridCol w:w="4680"/>
-        <w:gridCol w:w="4680"/>
-      </w:tblGrid>
-      <w:tr>
-        <w:tc>
-          <w:tcPr>
-            <w:tcW w:type="dxa" w:w="2592"/>
-            <w:shd w:fill="EDF2F7"/>
-            <w:tcMar>
-              <w:top w:w="70" w:type="dxa"/>
-              <w:bottom w:w="70" w:type="dxa"/>
-              <w:left w:w="100" w:type="dxa"/>
-              <w:right w:w="100" w:type="dxa"/>
-            </w:tcMar>
-          </w:tcPr>
-          <w:p>
-            <w:pPr>
-              <w:spacing w:before="40" w:after="40"/>
-            </w:pPr>
-            <w:r>
-              <w:rPr>
-                <w:rFonts w:ascii="Arial" w:hAnsi="Arial"/>
-                <w:b/>
-                <w:color w:val="2D3748"/>
-                <w:sz w:val="19"/>
-              </w:rPr>
-              <w:t>Finding</w:t>
-            </w:r>
-          </w:p>
-        </w:tc>
-        <w:tc>
-          <w:tcPr>
-            <w:tcW w:type="dxa" w:w="6768"/>
-            <w:shd w:fill="FFFFFF"/>
-            <w:tcMar>
-              <w:top w:w="70" w:type="dxa"/>
-              <w:bottom w:w="70" w:type="dxa"/>
-              <w:left w:w="100" w:type="dxa"/>
-              <w:right w:w="100" w:type="dxa"/>
-            </w:tcMar>
-          </w:tcPr>
-          <w:p>
-            <w:pPr>
-              <w:spacing w:before="40" w:after="40"/>
-            </w:pPr>
-            <w:r>
-              <w:rPr>
-                <w:rFonts w:ascii="Arial" w:hAnsi="Arial"/>
-                <w:sz w:val="19"/>
-              </w:rPr>
-              <w:t>Inadequate lubrication</w:t>
-            </w:r>
-          </w:p>
-        </w:tc>
-      </w:tr>
-      <w:tr>
-        <w:tc>
-          <w:tcPr>
-            <w:tcW w:type="dxa" w:w="2592"/>
-            <w:shd w:fill="EDF2F7"/>
-            <w:tcMar>
-              <w:top w:w="70" w:type="dxa"/>
-              <w:bottom w:w="70" w:type="dxa"/>
-              <w:left w:w="100" w:type="dxa"/>
-              <w:right w:w="100" w:type="dxa"/>
-            </w:tcMar>
-          </w:tcPr>
-          <w:p>
-            <w:pPr>
-              <w:spacing w:before="40" w:after="40"/>
-            </w:pPr>
-            <w:r>
-              <w:rPr>
-                <w:rFonts w:ascii="Arial" w:hAnsi="Arial"/>
-                <w:b/>
-                <w:color w:val="2D3748"/>
-                <w:sz w:val="19"/>
-              </w:rPr>
-              <w:t>Equipment</w:t>
-            </w:r>
-          </w:p>
-        </w:tc>
-        <w:tc>
-          <w:tcPr>
-            <w:tcW w:type="dxa" w:w="6768"/>
-            <w:shd w:fill="FFFFFF"/>
-            <w:tcMar>
-              <w:top w:w="70" w:type="dxa"/>
-              <w:bottom w:w="70" w:type="dxa"/>
-              <w:left w:w="100" w:type="dxa"/>
-              <w:right w:w="100" w:type="dxa"/>
-            </w:tcMar>
-          </w:tcPr>
-          <w:p>
-            <w:pPr>
-              <w:spacing w:before="40" w:after="40"/>
-            </w:pPr>
-            <w:r>
-              <w:rPr>
-                <w:rFonts w:ascii="Arial" w:hAnsi="Arial"/>
-                <w:sz w:val="19"/>
-              </w:rPr>
-              <w:t>P-101</w:t>
-            </w:r>
-          </w:p>
-        </w:tc>
-      </w:tr>
-      <w:tr>
-        <w:tc>
-          <w:tcPr>
-            <w:tcW w:type="dxa" w:w="2592"/>
-            <w:shd w:fill="EDF2F7"/>
-            <w:tcMar>
-              <w:top w:w="70" w:type="dxa"/>
-              <w:bottom w:w="70" w:type="dxa"/>
-              <w:left w:w="100" w:type="dxa"/>
-              <w:right w:w="100" w:type="dxa"/>
-            </w:tcMar>
-          </w:tcPr>
-          <w:p>
-            <w:pPr>
-              <w:spacing w:before="40" w:after="40"/>
-            </w:pPr>
-            <w:r>
-              <w:rPr>
-                <w:rFonts w:ascii="Arial" w:hAnsi="Arial"/>
-                <w:b/>
-                <w:color w:val="2D3748"/>
-                <w:sz w:val="19"/>
-              </w:rPr>
-              <w:t>Observed Value</w:t>
-            </w:r>
-          </w:p>
-        </w:tc>
-        <w:tc>
-          <w:tcPr>
-            <w:tcW w:type="dxa" w:w="6768"/>
-            <w:shd w:fill="FFFFFF"/>
-            <w:tcMar>
-              <w:top w:w="70" w:type="dxa"/>
-              <w:bottom w:w="70" w:type="dxa"/>
-              <w:left w:w="100" w:type="dxa"/>
-              <w:right w:w="100" w:type="dxa"/>
-            </w:tcMar>
-          </w:tcPr>
-          <w:p>
-            <w:pPr>
-              <w:spacing w:before="40" w:after="40"/>
-            </w:pPr>
-            <w:r>
-              <w:rPr>
-                <w:rFonts w:ascii="Arial" w:hAnsi="Arial"/>
-                <w:sz w:val="19"/>
-              </w:rPr>
-              <w:t>Low / insufficient grease</w:t>
-            </w:r>
-          </w:p>
-        </w:tc>
-      </w:tr>
-      <w:tr>
-        <w:tc>
-          <w:tcPr>
-            <w:tcW w:type="dxa" w:w="2592"/>
-            <w:shd w:fill="EDF2F7"/>
-            <w:tcMar>
-              <w:top w:w="70" w:type="dxa"/>
-              <w:bottom w:w="70" w:type="dxa"/>
-              <w:left w:w="100" w:type="dxa"/>
-              <w:right w:w="100" w:type="dxa"/>
-            </w:tcMar>
-          </w:tcPr>
-          <w:p>
-            <w:pPr>
-              <w:spacing w:before="40" w:after="40"/>
-            </w:pPr>
-            <w:r>
-              <w:rPr>
-                <w:rFonts w:ascii="Arial" w:hAnsi="Arial"/>
-                <w:b/>
-                <w:color w:val="2D3748"/>
-                <w:sz w:val="19"/>
-              </w:rPr>
-              <w:t>Limit</w:t>
-            </w:r>
-          </w:p>
-        </w:tc>
-        <w:tc>
-          <w:tcPr>
-            <w:tcW w:type="dxa" w:w="6768"/>
-            <w:shd w:fill="FFFFFF"/>
-            <w:tcMar>
-              <w:top w:w="70" w:type="dxa"/>
-              <w:bottom w:w="70" w:type="dxa"/>
-              <w:left w:w="100" w:type="dxa"/>
-              <w:right w:w="100" w:type="dxa"/>
-            </w:tcMar>
-          </w:tcPr>
-          <w:p>
-            <w:pPr>
-              <w:spacing w:before="40" w:after="40"/>
-            </w:pPr>
-            <w:r>
-              <w:rPr>
-                <w:rFonts w:ascii="Arial" w:hAnsi="Arial"/>
-                <w:sz w:val="19"/>
-              </w:rPr>
-              <w:t>Adequate lubrication required</w:t>
-            </w:r>
-          </w:p>
-        </w:tc>
-      </w:tr>
-      <w:tr>
-        <w:tc>
-          <w:tcPr>
-            <w:tcW w:type="dxa" w:w="2592"/>
-            <w:shd w:fill="EDF2F7"/>
-            <w:tcMar>
-              <w:top w:w="70" w:type="dxa"/>
-              <w:bottom w:w="70" w:type="dxa"/>
-              <w:left w:w="100" w:type="dxa"/>
-              <w:right w:w="100" w:type="dxa"/>
-            </w:tcMar>
-          </w:tcPr>
-          <w:p>
-            <w:pPr>
-              <w:spacing w:before="40" w:after="40"/>
-            </w:pPr>
-            <w:r>
-              <w:rPr>
-                <w:rFonts w:ascii="Arial" w:hAnsi="Arial"/>
-                <w:b/>
-                <w:color w:val="2D3748"/>
-                <w:sz w:val="19"/>
-              </w:rPr>
-              <w:t>Severity</w:t>
-            </w:r>
-          </w:p>
-        </w:tc>
-        <w:tc>
-          <w:tcPr>
-            <w:tcW w:type="dxa" w:w="6768"/>
-            <w:shd w:fill="FFFFFF"/>
-            <w:tcMar>
-              <w:top w:w="70" w:type="dxa"/>
-              <w:bottom w:w="70" w:type="dxa"/>
-              <w:left w:w="100" w:type="dxa"/>
-              <w:right w:w="100" w:type="dxa"/>
-            </w:tcMar>
-          </w:tcPr>
-          <w:p>
-            <w:pPr>
-              <w:spacing w:before="40" w:after="40"/>
-            </w:pPr>
-            <w:r>
-              <w:rPr>
-                <w:rFonts w:ascii="Arial" w:hAnsi="Arial"/>
-                <w:sz w:val="19"/>
-              </w:rPr>
-              <w:t>ABNORMAL</w:t>
-            </w:r>
-          </w:p>
-        </w:tc>
-      </w:tr>
-      <w:tr>
-        <w:tc>
-          <w:tcPr>
-            <w:tcW w:type="dxa" w:w="2592"/>
-            <w:shd w:fill="EDF2F7"/>
-            <w:tcMar>
-              <w:top w:w="70" w:type="dxa"/>
-              <w:bottom w:w="70" w:type="dxa"/>
-              <w:left w:w="100" w:type="dxa"/>
-              <w:right w:w="100" w:type="dxa"/>
-            </w:tcMar>
-          </w:tcPr>
-          <w:p>
-            <w:pPr>
-              <w:spacing w:before="40" w:after="40"/>
-            </w:pPr>
-            <w:r>
-              <w:rPr>
-                <w:rFonts w:ascii="Arial" w:hAnsi="Arial"/>
-                <w:b/>
-                <w:color w:val="2D3748"/>
-                <w:sz w:val="19"/>
-              </w:rPr>
-              <w:t>Evidence</w:t>
-            </w:r>
-          </w:p>
-        </w:tc>
-        <w:tc>
-          <w:tcPr>
-            <w:tcW w:type="dxa" w:w="6768"/>
-            <w:shd w:fill="FFFFFF"/>
-            <w:tcMar>
-              <w:top w:w="70" w:type="dxa"/>
-              <w:bottom w:w="70" w:type="dxa"/>
-              <w:left w:w="100" w:type="dxa"/>
-              <w:right w:w="100" w:type="dxa"/>
-            </w:tcMar>
-          </w:tcPr>
-          <w:p>
-            <w:pPr>
-              <w:spacing w:before="40" w:after="40"/>
-            </w:pPr>
-            <w:r>
-              <w:rPr>
-                <w:rFonts w:ascii="Arial" w:hAnsi="Arial"/>
-                <w:sz w:val="19"/>
-              </w:rPr>
-              <w:t>The affected maintenance area was identified for controlled inspection. The affected maintenance area was identified for controlled inspection.</w:t>
-            </w:r>
-          </w:p>
-        </w:tc>
-      </w:tr>
-    </w:tbl>
-    <w:p>
-      <w:pPr>
-        <w:spacing w:before="0" w:after="120"/>
-      </w:pPr>
-    </w:p>
-    <w:p>
-      <w:pPr>
-        <w:keepNext/>
         <w:spacing w:before="240" w:after="120"/>
       </w:pPr>
       <w:r>
@@ -1845,7 +813,7 @@
           <w:rFonts w:ascii="Arial" w:hAnsi="Arial"/>
           <w:sz w:val="20"/>
         </w:rPr>
-        <w:t>Evaluation was performed by correlating observed parameters against standard operating procedures (Maintenance_SOP.pdf, Demo_Maintenance_SOP.pdf). Assessment analysis indicates: The observed bearing temperature of 92 °C exceeds the normal operating limit of up to 80 °C, indicating a potential risk to equipment and process safety.</w:t>
+        <w:t>Evaluation was performed by correlating observed parameters against standard operating procedures (Demo_Maintenance_SOP.pdf). Assessment analysis indicates: The observed bearing temperature exceeds the documented limit by 12 °C, indicating a potential failure condition.</w:t>
       </w:r>
     </w:p>
     <w:p>
@@ -1961,7 +929,7 @@
                 <w:rFonts w:ascii="Arial" w:hAnsi="Arial"/>
                 <w:sz w:val="19"/>
               </w:rPr>
-              <w:t>The observed bearing temperature of 92 °C exceeds the normal operating limit of up to 80 °C, indicating a potential risk to equipment and process safety.</w:t>
+              <w:t>The observed bearing temperature exceeds the documented limit by 12 °C, indicating a potential failure condition.</w:t>
             </w:r>
           </w:p>
         </w:tc>
@@ -2019,7 +987,7 @@
                 <w:color w:val="2B6CB0"/>
                 <w:sz w:val="20"/>
               </w:rPr>
-              <w:t>Inspect the bearing assembly, check lubrication condition, and check for abnormal vibration. Do not return equipment to service until inspection is complete. Schedule an immediate bearing inspection and lubrication check, and do not return the equipment to service until the issue is resolved. Schedule a bearing inspection and lubrication check for P-101 as soon as possible to prevent potential damage or failure. Schedule a bearing inspection and lubrication check to ensure the pump is operating within normal parameters. Check and replenish lubrication in P-101 equipment as soon as possible, following the approved maintenance procedure to prevent further damage or risk to the equipment.</w:t>
+              <w:t>Record the observed temperature and inspect the bearing assembly, check lubrication condition, and check for abnormal vibration. Do not return equipment to service until inspection is complete. Perform immediate inspection of the pump bearing housing and conduct further investigation to determine the cause of abnormal vibration. Check lubrication condition and consider replacing the bearing assembly if necessary. Follow the Demo Maintenance SOP for corrective action.</w:t>
             </w:r>
           </w:p>
         </w:tc>
@@ -2063,28 +1031,7 @@
           <w:rFonts w:ascii="Arial" w:hAnsi="Arial"/>
           <w:sz w:val="19"/>
         </w:rPr>
-        <w:t>Filename: Demo_Maintenance_SOP.pdf | Page: 1 | Chunk Index: 0 | Document ID: c2fd4c4f-8d4e-406e-9bb2-7b3c6e94d9b5</w:t>
-      </w:r>
-    </w:p>
-    <w:p>
-      <w:pPr>
-        <w:spacing w:after="80"/>
-        <w:ind w:left="360"/>
-      </w:pPr>
-      <w:r>
-        <w:rPr>
-          <w:rFonts w:ascii="Arial" w:hAnsi="Arial"/>
-          <w:b/>
-          <w:sz w:val="19"/>
-        </w:rPr>
-        <w:t xml:space="preserve">[2] </w:t>
-      </w:r>
-      <w:r>
-        <w:rPr>
-          <w:rFonts w:ascii="Arial" w:hAnsi="Arial"/>
-          <w:sz w:val="19"/>
-        </w:rPr>
-        <w:t>Filename: Maintenance_SOP.pdf | Page: 1 | Chunk Index: 0 | Document ID: doc_5ffb032d</w:t>
+        <w:t>Filename: Demo_Maintenance_SOP.pdf | Page: 1 | Chunk Index: 0 | Document ID: 31bc6f43-a5fb-47b7-9bee-5bc9deb0a2b1</w:t>
       </w:r>
     </w:p>
     <w:p>

</xml_diff>